<commit_message>
Added Model Recommendation System
</commit_message>
<xml_diff>
--- a/ReportProjectInterfaceDesign_DangQuynhChi.docx
+++ b/ReportProjectInterfaceDesign_DangQuynhChi.docx
@@ -99,7 +99,29 @@
           <w:bdr w:val="single" w:sz="2" w:space="0" w:color="E4E4E7" w:frame="1"/>
           <w14:ligatures w14:val="none"/>
         </w:rPr>
-        <w:t>: Promotional sections for deals (e.g., 11.11 sale, flash sales).</w:t>
+        <w:t xml:space="preserve">: Promotional sections for deals (e.g., 11.11 </w:t>
+      </w:r>
+      <w:proofErr w:type="gramStart"/>
+      <w:r>
+        <w:rPr>
+          <w:rFonts w:ascii="Arial" w:eastAsia="Times New Roman" w:hAnsi="Arial" w:cs="Arial"/>
+          <w:color w:val="374151"/>
+          <w:kern w:val="0"/>
+          <w:bdr w:val="single" w:sz="2" w:space="0" w:color="E4E4E7" w:frame="1"/>
+          <w14:ligatures w14:val="none"/>
+        </w:rPr>
+        <w:t>sale</w:t>
+      </w:r>
+      <w:proofErr w:type="gramEnd"/>
+      <w:r>
+        <w:rPr>
+          <w:rFonts w:ascii="Arial" w:eastAsia="Times New Roman" w:hAnsi="Arial" w:cs="Arial"/>
+          <w:color w:val="374151"/>
+          <w:kern w:val="0"/>
+          <w:bdr w:val="single" w:sz="2" w:space="0" w:color="E4E4E7" w:frame="1"/>
+          <w14:ligatures w14:val="none"/>
+        </w:rPr>
+        <w:t>, flash sales).</w:t>
       </w:r>
     </w:p>
     <w:p>
@@ -275,7 +297,29 @@
           <w:bdr w:val="single" w:sz="2" w:space="0" w:color="E4E4E7" w:frame="1"/>
           <w14:ligatures w14:val="none"/>
         </w:rPr>
-        <w:t>: Inline CSS for quick setup; in a real project, use SCSS or a framework like Vuetify.</w:t>
+        <w:t xml:space="preserve">: Inline CSS for quick setup; in a real project, use SCSS or a framework like </w:t>
+      </w:r>
+      <w:proofErr w:type="spellStart"/>
+      <w:r>
+        <w:rPr>
+          <w:rFonts w:ascii="Arial" w:eastAsia="Times New Roman" w:hAnsi="Arial" w:cs="Arial"/>
+          <w:color w:val="374151"/>
+          <w:kern w:val="0"/>
+          <w:bdr w:val="single" w:sz="2" w:space="0" w:color="E4E4E7" w:frame="1"/>
+          <w14:ligatures w14:val="none"/>
+        </w:rPr>
+        <w:t>Vuetify</w:t>
+      </w:r>
+      <w:proofErr w:type="spellEnd"/>
+      <w:r>
+        <w:rPr>
+          <w:rFonts w:ascii="Arial" w:eastAsia="Times New Roman" w:hAnsi="Arial" w:cs="Arial"/>
+          <w:color w:val="374151"/>
+          <w:kern w:val="0"/>
+          <w:bdr w:val="single" w:sz="2" w:space="0" w:color="E4E4E7" w:frame="1"/>
+          <w14:ligatures w14:val="none"/>
+        </w:rPr>
+        <w:t>.</w:t>
       </w:r>
     </w:p>
     <w:p>
@@ -319,18 +363,6 @@
     </w:p>
     <w:p>
       <w:pPr>
-        <w:pStyle w:val="ListParagraph"/>
-        <w:numPr>
-          <w:ilvl w:val="0"/>
-          <w:numId w:val="1"/>
-        </w:numPr>
-      </w:pPr>
-      <w:r>
-        <w:t>Checkout page</w:t>
-      </w:r>
-    </w:p>
-    <w:p>
-      <w:pPr>
         <w:rPr>
           <w:b/>
           <w:bCs/>
@@ -421,9 +453,8 @@
         <w:rPr>
           <w:noProof/>
         </w:rPr>
-        <w:lastRenderedPageBreak/>
         <w:drawing>
-          <wp:inline distT="0" distB="0" distL="0" distR="0" wp14:anchorId="1962A843" wp14:editId="1D3D8A16">
+          <wp:inline distT="0" distB="0" distL="0" distR="0" wp14:anchorId="1962A843" wp14:editId="520B9E9E">
             <wp:extent cx="5943600" cy="3318510"/>
             <wp:effectExtent l="0" t="0" r="0" b="0"/>
             <wp:docPr id="323097422" name="Picture 1"/>
@@ -434,7 +465,7 @@
               <a:graphicData uri="http://schemas.openxmlformats.org/drawingml/2006/picture">
                 <pic:pic xmlns:pic="http://schemas.openxmlformats.org/drawingml/2006/picture">
                   <pic:nvPicPr>
-                    <pic:cNvPr id="323097422" name=""/>
+                    <pic:cNvPr id="323097422" name="Picture 1"/>
                     <pic:cNvPicPr/>
                   </pic:nvPicPr>
                   <pic:blipFill>
@@ -461,6 +492,7 @@
     </w:p>
     <w:p>
       <w:r>
+        <w:lastRenderedPageBreak/>
         <w:t>Before: performance check</w:t>
       </w:r>
     </w:p>
@@ -469,9 +501,8 @@
         <w:rPr>
           <w:noProof/>
         </w:rPr>
-        <w:lastRenderedPageBreak/>
         <w:drawing>
-          <wp:inline distT="0" distB="0" distL="0" distR="0" wp14:anchorId="3D2A38F2" wp14:editId="17D77F6C">
+          <wp:inline distT="0" distB="0" distL="0" distR="0" wp14:anchorId="3D2A38F2" wp14:editId="1F316AA1">
             <wp:extent cx="5849166" cy="5153744"/>
             <wp:effectExtent l="0" t="0" r="0" b="8890"/>
             <wp:docPr id="292561409" name="Picture 1"/>
@@ -553,12 +584,18 @@
     </w:p>
     <w:p>
       <w:r>
-        <w:t>After implementing recycler scroller. The painting time aka the time taken to render pixel on screen is reduced dramatically. It is reduced over half</w:t>
-      </w:r>
-    </w:p>
-    <w:p>
-      <w:r>
-        <w:t>&lt;&lt; Try this again with a scroller web test framework&gt;&gt;</w:t>
+        <w:t xml:space="preserve">After implementing recycler scroller. The painting time aka the time taken to render </w:t>
+      </w:r>
+      <w:proofErr w:type="gramStart"/>
+      <w:r>
+        <w:t>pixel</w:t>
+      </w:r>
+      <w:proofErr w:type="gramEnd"/>
+      <w:r>
+        <w:t xml:space="preserve"> on screen is reduced dramatically.</w:t>
+      </w:r>
+      <w:r>
+        <w:t xml:space="preserve"> </w:t>
       </w:r>
     </w:p>
     <w:p>
@@ -573,8 +610,17 @@
           <w:b/>
           <w:bCs/>
         </w:rPr>
-        <w:t>2. Real-time Features with WebSockets</w:t>
-      </w:r>
+        <w:t xml:space="preserve">2. Real-time Features with </w:t>
+      </w:r>
+      <w:proofErr w:type="spellStart"/>
+      <w:r>
+        <w:rPr>
+          <w:b/>
+          <w:bCs/>
+        </w:rPr>
+        <w:t>WebSockets</w:t>
+      </w:r>
+      <w:proofErr w:type="spellEnd"/>
     </w:p>
     <w:p>
       <w:pPr>

</xml_diff>